<commit_message>
chap 11 drop in
</commit_message>
<xml_diff>
--- a/docs/handouts/Ch11_Automation_STUDENT.docx
+++ b/docs/handouts/Ch11_Automation_STUDENT.docx
@@ -3008,7 +3008,7 @@
           <w:i w:val="false"/>
           <w:iCs w:val="false"/>
         </w:rPr>
-        <w:t xml:space="preserve">Fill in the sense → decide → act loop in plain language </w:t>
+        <w:t xml:space="preserve">Match your project to a pattern (A–D) from the chapter, then fill in the sense → decide → act loop in plain language </w:t>
       </w:r>
       <w:r>
         <w:rPr>
@@ -3026,7 +3026,7 @@
           <w:i w:val="false"/>
           <w:iCs w:val="false"/>
         </w:rPr>
-        <w:t xml:space="preserve"> you write C++.</w:t>
+        <w:t xml:space="preserve"> you write C++. To pick your threshold, read the sensor value on the Brain's Devices screen at the real trigger distance.</w:t>
       </w:r>
     </w:p>
     <w:p>
@@ -3656,6 +3656,184 @@
                 <w:iCs w:val="false"/>
               </w:rPr>
               <w:t xml:space="preserve"> </w:t>
+            </w:r>
+          </w:p>
+        </w:tc>
+      </w:tr>
+    </w:tbl>
+    <w:p>
+      <w:pPr>
+        <w:pBdr>
+          <w:bottom w:val="single" w:color="2E75B6" w:sz="6" w:space="2"/>
+        </w:pBdr>
+        <w:spacing w:after="70" w:before="200"/>
+      </w:pPr>
+      <w:r>
+        <w:rPr>
+          <w:b/>
+          <w:bCs/>
+          <w:i w:val="false"/>
+          <w:iCs w:val="false"/>
+          <w:color w:val="2E75B6"/>
+          <w:sz w:val="24"/>
+          <w:szCs w:val="24"/>
+        </w:rPr>
+        <w:t xml:space="preserve">How You'll Be Assessed</w:t>
+      </w:r>
+    </w:p>
+    <w:tbl>
+      <w:tblPr>
+        <w:tblW w:type="dxa" w:w="9360"/>
+        <w:tblBorders>
+          <w:top w:val="none"/>
+          <w:left w:val="single" w:color="2E75B6" w:sz="18"/>
+          <w:bottom w:val="none"/>
+          <w:right w:val="none"/>
+          <w:insideH w:val="none"/>
+          <w:insideV w:val="none"/>
+        </w:tblBorders>
+      </w:tblPr>
+      <w:tblGrid>
+        <w:gridCol w:w="100"/>
+      </w:tblGrid>
+      <w:tr>
+        <w:tc>
+          <w:tcPr>
+            <w:tcW w:type="dxa" w:w="9360"/>
+            <w:shd w:fill="F2F7FC" w:val="clear"/>
+            <w:tcMar>
+              <w:top w:type="dxa" w:w="100"/>
+              <w:left w:type="dxa" w:w="170"/>
+              <w:bottom w:type="dxa" w:w="100"/>
+              <w:right w:type="dxa" w:w="150"/>
+            </w:tcMar>
+          </w:tcPr>
+          <w:p>
+            <w:pPr>
+              <w:spacing w:after="50" w:line="258"/>
+            </w:pPr>
+            <w:r>
+              <w:rPr>
+                <w:b w:val="false"/>
+                <w:bCs w:val="false"/>
+                <w:i w:val="false"/>
+                <w:iCs w:val="false"/>
+              </w:rPr>
+              <w:t xml:space="preserve">•  It works as an </w:t>
+            </w:r>
+            <w:r>
+              <w:rPr>
+                <w:b/>
+                <w:bCs/>
+                <w:i w:val="false"/>
+                <w:iCs w:val="false"/>
+              </w:rPr>
+              <w:t xml:space="preserve">automatic, closed-loop</w:t>
+            </w:r>
+            <w:r>
+              <w:rPr>
+                <w:b w:val="false"/>
+                <w:bCs w:val="false"/>
+                <w:i w:val="false"/>
+                <w:iCs w:val="false"/>
+              </w:rPr>
+              <w:t xml:space="preserve"> device — senses and responds with no one driving it.</w:t>
+            </w:r>
+          </w:p>
+          <w:p>
+            <w:pPr>
+              <w:spacing w:after="50" w:line="258"/>
+            </w:pPr>
+            <w:r>
+              <w:rPr>
+                <w:b w:val="false"/>
+                <w:bCs w:val="false"/>
+                <w:i w:val="false"/>
+                <w:iCs w:val="false"/>
+              </w:rPr>
+              <w:t xml:space="preserve">•  The code is a clear </w:t>
+            </w:r>
+            <w:r>
+              <w:rPr>
+                <w:b/>
+                <w:bCs/>
+                <w:i w:val="false"/>
+                <w:iCs w:val="false"/>
+              </w:rPr>
+              <w:t xml:space="preserve">sense → decide → act</w:t>
+            </w:r>
+            <w:r>
+              <w:rPr>
+                <w:b w:val="false"/>
+                <w:bCs w:val="false"/>
+                <w:i w:val="false"/>
+                <w:iCs w:val="false"/>
+              </w:rPr>
+              <w:t xml:space="preserve"> loop — a sensor read, an if/else, a motor — inside while (true) with a wait.</w:t>
+            </w:r>
+          </w:p>
+          <w:p>
+            <w:pPr>
+              <w:spacing w:after="50" w:line="258"/>
+            </w:pPr>
+            <w:r>
+              <w:rPr>
+                <w:b w:val="false"/>
+                <w:bCs w:val="false"/>
+                <w:i w:val="false"/>
+                <w:iCs w:val="false"/>
+              </w:rPr>
+              <w:t xml:space="preserve">•  The </w:t>
+            </w:r>
+            <w:r>
+              <w:rPr>
+                <w:b/>
+                <w:bCs/>
+                <w:i w:val="false"/>
+                <w:iCs w:val="false"/>
+              </w:rPr>
+              <w:t xml:space="preserve">design process is documented</w:t>
+            </w:r>
+            <w:r>
+              <w:rPr>
+                <w:b w:val="false"/>
+                <w:bCs w:val="false"/>
+                <w:i w:val="false"/>
+                <w:iCs w:val="false"/>
+              </w:rPr>
+              <w:t xml:space="preserve"> — brief, decision matrix, pseudocode, and a daily journal.</w:t>
+            </w:r>
+          </w:p>
+          <w:p>
+            <w:pPr>
+              <w:spacing w:after="0" w:line="258"/>
+            </w:pPr>
+            <w:r>
+              <w:rPr>
+                <w:b w:val="false"/>
+                <w:bCs w:val="false"/>
+                <w:i w:val="false"/>
+                <w:iCs w:val="false"/>
+              </w:rPr>
+              <w:t xml:space="preserve">•  You can </w:t>
+            </w:r>
+            <w:r>
+              <w:rPr>
+                <w:b/>
+                <w:bCs/>
+                <w:i w:val="false"/>
+                <w:iCs w:val="false"/>
+              </w:rPr>
+              <w:t xml:space="preserve">point to the exact line</w:t>
+            </w:r>
+            <w:r>
+              <w:rPr>
+                <w:b w:val="false"/>
+                <w:bCs w:val="false"/>
+                <w:i w:val="false"/>
+                <w:iCs w:val="false"/>
+              </w:rPr>
+              <w:t xml:space="preserve"> that senses, the line that decides, and the line that acts in your own program.</w:t>
             </w:r>
           </w:p>
         </w:tc>

</xml_diff>